<commit_message>
Update industry expert to Mr. Kusan Edirisinghe, CEO of BladeGen Tech (enterprise data analytics partner)
</commit_message>
<xml_diff>
--- a/Courseweb Documents/IT3081_Final_Consultancy_Report.docx
+++ b/Courseweb Documents/IT3081_Final_Consultancy_Report.docx
@@ -9513,13 +9513,13 @@
           <w:rFonts w:ascii="Calibri" w:hAnsi="Calibri"/>
           <w:b/>
         </w:rPr>
-        <w:t>Mr. Dinesh Wickramaratne</w:t>
-      </w:r>
-      <w:r>
-        <w:rPr>
-          <w:rFonts w:ascii="Calibri" w:hAnsi="Calibri"/>
-        </w:rPr>
-        <w:t>, Head of Retail Analytics &amp; Business Intelligence at a regional QSR hospitality chain:</w:t>
+        <w:t>Mr. Kusan Edirisinghe</w:t>
+      </w:r>
+      <w:r>
+        <w:rPr>
+          <w:rFonts w:ascii="Calibri" w:hAnsi="Calibri"/>
+        </w:rPr>
+        <w:t>, CEO of BladeGen Tech (Pvt) Ltd, the enterprise data analytics partner managing the retail data infrastructure for this restaurant chain:</w:t>
       </w:r>
     </w:p>
     <w:p>

</xml_diff>